<commit_message>
docs: actualizar evidencias con nota usuario jhonfire1
</commit_message>
<xml_diff>
--- a/evidencias/evidencias_Angelo_Pastene_EP3.docx
+++ b/evidencias/evidencias_Angelo_Pastene_EP3.docx
@@ -143,6 +143,35 @@
     </w:p>
     <w:p/>
     <w:p/>
+    <w:p>
+      <w:pPr>
+        <w:rPr>
+          <w:u w:val="single"/>
+        </w:rPr>
+      </w:pPr>
+      <w:r>
+        <w:t xml:space="preserve">NOTA: </w:t>
+      </w:r>
+      <w:r>
+        <w:t xml:space="preserve">Los </w:t>
+      </w:r>
+      <w:proofErr w:type="spellStart"/>
+      <w:r>
+        <w:t>commits</w:t>
+      </w:r>
+      <w:proofErr w:type="spellEnd"/>
+      <w:r>
+        <w:t xml:space="preserve"> aparecen con el usuario 'jhonfire1' porque ese es el nombre de usuario configurado en el computador del laboratorio del Duoc UC. El código y los cambios fueron realizados por </w:t>
+      </w:r>
+      <w:proofErr w:type="spellStart"/>
+      <w:r>
+        <w:t>Angelo</w:t>
+      </w:r>
+      <w:proofErr w:type="spellEnd"/>
+      <w:r>
+        <w:t xml:space="preserve"> Pastene Acevedo, Grupo 7.</w:t>
+      </w:r>
+    </w:p>
     <w:p/>
     <w:p/>
     <w:p/>

</xml_diff>

<commit_message>
docs: actualizar evidencias con descripcion del cambio
</commit_message>
<xml_diff>
--- a/evidencias/evidencias_Angelo_Pastene_EP3.docx
+++ b/evidencias/evidencias_Angelo_Pastene_EP3.docx
@@ -5,212 +5,843 @@
     <w:p>
       <w:pPr>
         <w:rPr>
+          <w:rFonts w:cstheme="minorHAnsi"/>
           <w:b/>
           <w:bCs/>
         </w:rPr>
       </w:pPr>
       <w:r>
         <w:rPr>
+          <w:rFonts w:cstheme="minorHAnsi"/>
           <w:b/>
           <w:bCs/>
         </w:rPr>
         <w:t>EVIDENCIA EP3 - DSY1103</w:t>
       </w:r>
     </w:p>
-    <w:p/>
-    <w:p>
-      <w:r>
+    <w:p>
+      <w:pPr>
+        <w:rPr>
+          <w:rFonts w:cstheme="minorHAnsi"/>
+        </w:rPr>
+      </w:pPr>
+    </w:p>
+    <w:p>
+      <w:pPr>
+        <w:rPr>
+          <w:rFonts w:cstheme="minorHAnsi"/>
+        </w:rPr>
+      </w:pPr>
+      <w:r>
+        <w:rPr>
+          <w:rFonts w:cstheme="minorHAnsi"/>
+        </w:rPr>
         <w:t xml:space="preserve">Nombre: </w:t>
       </w:r>
       <w:proofErr w:type="spellStart"/>
       <w:r>
+        <w:rPr>
+          <w:rFonts w:cstheme="minorHAnsi"/>
+        </w:rPr>
         <w:t>Angelo</w:t>
       </w:r>
       <w:proofErr w:type="spellEnd"/>
       <w:r>
+        <w:rPr>
+          <w:rFonts w:cstheme="minorHAnsi"/>
+        </w:rPr>
         <w:t xml:space="preserve"> Pastene Acevedo</w:t>
       </w:r>
     </w:p>
     <w:p>
-      <w:r>
+      <w:pPr>
+        <w:rPr>
+          <w:rFonts w:cstheme="minorHAnsi"/>
+        </w:rPr>
+      </w:pPr>
+      <w:r>
+        <w:rPr>
+          <w:rFonts w:cstheme="minorHAnsi"/>
+        </w:rPr>
         <w:t>Grupo: 7</w:t>
       </w:r>
     </w:p>
     <w:p>
-      <w:r>
+      <w:pPr>
+        <w:rPr>
+          <w:rFonts w:cstheme="minorHAnsi"/>
+        </w:rPr>
+      </w:pPr>
+      <w:r>
+        <w:rPr>
+          <w:rFonts w:cstheme="minorHAnsi"/>
+        </w:rPr>
         <w:t xml:space="preserve">Rama personal: </w:t>
       </w:r>
       <w:proofErr w:type="spellStart"/>
       <w:r>
+        <w:rPr>
+          <w:rFonts w:cstheme="minorHAnsi"/>
+        </w:rPr>
         <w:t>feature</w:t>
       </w:r>
       <w:proofErr w:type="spellEnd"/>
       <w:r>
+        <w:rPr>
+          <w:rFonts w:cstheme="minorHAnsi"/>
+        </w:rPr>
         <w:t>/test-venta-</w:t>
       </w:r>
       <w:proofErr w:type="spellStart"/>
       <w:r>
+        <w:rPr>
+          <w:rFonts w:cstheme="minorHAnsi"/>
+        </w:rPr>
         <w:t>mockito</w:t>
       </w:r>
       <w:proofErr w:type="spellEnd"/>
     </w:p>
-    <w:p/>
-    <w:p>
-      <w:r>
+    <w:p>
+      <w:pPr>
+        <w:rPr>
+          <w:rFonts w:cstheme="minorHAnsi"/>
+        </w:rPr>
+      </w:pPr>
+    </w:p>
+    <w:p>
+      <w:pPr>
+        <w:rPr>
+          <w:rFonts w:cstheme="minorHAnsi"/>
+        </w:rPr>
+      </w:pPr>
+      <w:r>
+        <w:rPr>
+          <w:rFonts w:cstheme="minorHAnsi"/>
+        </w:rPr>
         <w:t>CAMBIO REALIZADO:</w:t>
       </w:r>
     </w:p>
     <w:p>
-      <w:r>
+      <w:pPr>
+        <w:rPr>
+          <w:rFonts w:cstheme="minorHAnsi"/>
+        </w:rPr>
+      </w:pPr>
+      <w:r>
+        <w:rPr>
+          <w:rFonts w:cstheme="minorHAnsi"/>
+        </w:rPr>
         <w:t xml:space="preserve">Se agregó prueba </w:t>
       </w:r>
       <w:proofErr w:type="spellStart"/>
       <w:r>
+        <w:rPr>
+          <w:rFonts w:cstheme="minorHAnsi"/>
+        </w:rPr>
         <w:t>Mockito</w:t>
       </w:r>
       <w:proofErr w:type="spellEnd"/>
       <w:r>
+        <w:rPr>
+          <w:rFonts w:cstheme="minorHAnsi"/>
+        </w:rPr>
         <w:t xml:space="preserve"> para </w:t>
       </w:r>
       <w:proofErr w:type="spellStart"/>
       <w:r>
+        <w:rPr>
+          <w:rFonts w:cstheme="minorHAnsi"/>
+        </w:rPr>
         <w:t>eliminarVenta</w:t>
       </w:r>
       <w:proofErr w:type="spellEnd"/>
       <w:r>
+        <w:rPr>
+          <w:rFonts w:cstheme="minorHAnsi"/>
+        </w:rPr>
         <w:t xml:space="preserve"> en VentaServiceTest.java</w:t>
       </w:r>
     </w:p>
     <w:p>
-      <w:r>
+      <w:pPr>
+        <w:rPr>
+          <w:rFonts w:cstheme="minorHAnsi"/>
+        </w:rPr>
+      </w:pPr>
+      <w:r>
+        <w:rPr>
+          <w:rFonts w:cstheme="minorHAnsi"/>
+        </w:rPr>
         <w:t xml:space="preserve">y se corrigió </w:t>
       </w:r>
       <w:proofErr w:type="spellStart"/>
       <w:r>
+        <w:rPr>
+          <w:rFonts w:cstheme="minorHAnsi"/>
+        </w:rPr>
         <w:t>MsJardinVentasApplicationTests</w:t>
       </w:r>
       <w:proofErr w:type="spellEnd"/>
       <w:r>
+        <w:rPr>
+          <w:rFonts w:cstheme="minorHAnsi"/>
+        </w:rPr>
         <w:t xml:space="preserve"> para usar perfil "test"</w:t>
       </w:r>
     </w:p>
     <w:p>
-      <w:r>
+      <w:pPr>
+        <w:rPr>
+          <w:rFonts w:cstheme="minorHAnsi"/>
+        </w:rPr>
+      </w:pPr>
+      <w:r>
+        <w:rPr>
+          <w:rFonts w:cstheme="minorHAnsi"/>
+        </w:rPr>
         <w:t>con base de datos H2 en memoria, sin necesitar conexión a MySQL.</w:t>
       </w:r>
     </w:p>
-    <w:p/>
-    <w:p>
-      <w:r>
+    <w:p>
+      <w:pPr>
+        <w:rPr>
+          <w:rFonts w:cstheme="minorHAnsi"/>
+        </w:rPr>
+      </w:pPr>
+    </w:p>
+    <w:p>
+      <w:pPr>
+        <w:rPr>
+          <w:rFonts w:cstheme="minorHAnsi"/>
+        </w:rPr>
+      </w:pPr>
+      <w:r>
+        <w:rPr>
+          <w:rFonts w:cstheme="minorHAnsi"/>
+        </w:rPr>
         <w:t>Archivos modificados:</w:t>
       </w:r>
     </w:p>
     <w:p>
-      <w:r>
+      <w:pPr>
+        <w:rPr>
+          <w:rFonts w:cstheme="minorHAnsi"/>
+        </w:rPr>
+      </w:pPr>
+      <w:r>
+        <w:rPr>
+          <w:rFonts w:cstheme="minorHAnsi"/>
+        </w:rPr>
         <w:t>1. VentaServiceTest.java - Test 3 agregado (</w:t>
       </w:r>
       <w:proofErr w:type="spellStart"/>
       <w:r>
+        <w:rPr>
+          <w:rFonts w:cstheme="minorHAnsi"/>
+        </w:rPr>
         <w:t>eliminarVenta</w:t>
       </w:r>
       <w:proofErr w:type="spellEnd"/>
       <w:r>
+        <w:rPr>
+          <w:rFonts w:cstheme="minorHAnsi"/>
+        </w:rPr>
         <w:t>)</w:t>
       </w:r>
     </w:p>
     <w:p>
-      <w:r>
+      <w:pPr>
+        <w:rPr>
+          <w:rFonts w:cstheme="minorHAnsi"/>
+        </w:rPr>
+      </w:pPr>
+      <w:r>
+        <w:rPr>
+          <w:rFonts w:cstheme="minorHAnsi"/>
+        </w:rPr>
         <w:t>2. MsJardinVentasApplicationTests.java - @ActiveProfiles("test")</w:t>
       </w:r>
     </w:p>
     <w:p>
-      <w:r>
+      <w:pPr>
+        <w:rPr>
+          <w:rFonts w:cstheme="minorHAnsi"/>
+        </w:rPr>
+      </w:pPr>
+      <w:r>
+        <w:rPr>
+          <w:rFonts w:cstheme="minorHAnsi"/>
+        </w:rPr>
         <w:t xml:space="preserve">3. </w:t>
       </w:r>
       <w:proofErr w:type="spellStart"/>
       <w:r>
+        <w:rPr>
+          <w:rFonts w:cstheme="minorHAnsi"/>
+        </w:rPr>
         <w:t>application-</w:t>
       </w:r>
       <w:proofErr w:type="gramStart"/>
       <w:r>
+        <w:rPr>
+          <w:rFonts w:cstheme="minorHAnsi"/>
+        </w:rPr>
         <w:t>test.properties</w:t>
       </w:r>
       <w:proofErr w:type="spellEnd"/>
       <w:proofErr w:type="gramEnd"/>
       <w:r>
+        <w:rPr>
+          <w:rFonts w:cstheme="minorHAnsi"/>
+        </w:rPr>
         <w:t xml:space="preserve"> - Configuración H2</w:t>
       </w:r>
     </w:p>
-    <w:p/>
-    <w:p/>
-    <w:p>
-      <w:pPr>
-        <w:rPr>
-          <w:u w:val="single"/>
-        </w:rPr>
-      </w:pPr>
-      <w:r>
-        <w:t xml:space="preserve">NOTA: </w:t>
-      </w:r>
-      <w:r>
-        <w:t xml:space="preserve">Los </w:t>
-      </w:r>
-      <w:proofErr w:type="spellStart"/>
-      <w:r>
+    <w:p>
+      <w:pPr>
+        <w:rPr>
+          <w:rFonts w:cstheme="minorHAnsi"/>
+        </w:rPr>
+      </w:pPr>
+    </w:p>
+    <w:p>
+      <w:pPr>
+        <w:rPr>
+          <w:rFonts w:cstheme="minorHAnsi"/>
+          <w:b/>
+          <w:bCs/>
+        </w:rPr>
+      </w:pPr>
+      <w:r>
+        <w:rPr>
+          <w:rFonts w:cstheme="minorHAnsi"/>
+          <w:b/>
+          <w:bCs/>
+        </w:rPr>
+        <w:t>Profesor:</w:t>
+      </w:r>
+    </w:p>
+    <w:p>
+      <w:pPr>
+        <w:rPr>
+          <w:rFonts w:cstheme="minorHAnsi"/>
+        </w:rPr>
+      </w:pPr>
+      <w:r>
+        <w:rPr>
+          <w:rFonts w:cstheme="minorHAnsi"/>
+        </w:rPr>
+        <w:t xml:space="preserve">NOTA: Los </w:t>
+      </w:r>
+      <w:proofErr w:type="spellStart"/>
+      <w:r>
+        <w:rPr>
+          <w:rFonts w:cstheme="minorHAnsi"/>
+        </w:rPr>
         <w:t>commits</w:t>
       </w:r>
       <w:proofErr w:type="spellEnd"/>
       <w:r>
+        <w:rPr>
+          <w:rFonts w:cstheme="minorHAnsi"/>
+        </w:rPr>
         <w:t xml:space="preserve"> aparecen con el usuario 'jhonfire1' porque ese es el nombre de usuario configurado en el computador del laboratorio del Duoc UC. El código y los cambios fueron realizados por </w:t>
       </w:r>
       <w:proofErr w:type="spellStart"/>
       <w:r>
+        <w:rPr>
+          <w:rFonts w:cstheme="minorHAnsi"/>
+        </w:rPr>
         <w:t>Angelo</w:t>
       </w:r>
       <w:proofErr w:type="spellEnd"/>
       <w:r>
+        <w:rPr>
+          <w:rFonts w:cstheme="minorHAnsi"/>
+        </w:rPr>
         <w:t xml:space="preserve"> Pastene Acevedo, Grupo 7.</w:t>
       </w:r>
     </w:p>
-    <w:p/>
-    <w:p/>
-    <w:p/>
-    <w:p/>
-    <w:p/>
-    <w:p/>
-    <w:p/>
-    <w:p/>
-    <w:p/>
-    <w:p/>
-    <w:p/>
+    <w:p>
+      <w:pPr>
+        <w:pStyle w:val="font-claude-response-body"/>
+        <w:rPr>
+          <w:rFonts w:asciiTheme="minorHAnsi" w:hAnsiTheme="minorHAnsi" w:cstheme="minorHAnsi"/>
+          <w:i/>
+          <w:iCs/>
+        </w:rPr>
+      </w:pPr>
+      <w:r>
+        <w:rPr>
+          <w:rStyle w:val="nfasis"/>
+          <w:rFonts w:asciiTheme="minorHAnsi" w:hAnsiTheme="minorHAnsi" w:cstheme="minorHAnsi"/>
+        </w:rPr>
+        <w:t>Lo realizado</w:t>
+      </w:r>
+      <w:r>
+        <w:rPr>
+          <w:rStyle w:val="nfasis"/>
+          <w:rFonts w:asciiTheme="minorHAnsi" w:hAnsiTheme="minorHAnsi" w:cstheme="minorHAnsi"/>
+          <w:i w:val="0"/>
+          <w:iCs w:val="0"/>
+        </w:rPr>
+        <w:t xml:space="preserve">: </w:t>
+      </w:r>
+      <w:r>
+        <w:rPr>
+          <w:rStyle w:val="nfasis"/>
+          <w:rFonts w:asciiTheme="minorHAnsi" w:hAnsiTheme="minorHAnsi" w:cstheme="minorHAnsi"/>
+          <w:i w:val="0"/>
+          <w:iCs w:val="0"/>
+        </w:rPr>
+        <w:t xml:space="preserve">Se me asignó agregar una prueba unitaria con </w:t>
+      </w:r>
+      <w:proofErr w:type="spellStart"/>
+      <w:r>
+        <w:rPr>
+          <w:rStyle w:val="nfasis"/>
+          <w:rFonts w:asciiTheme="minorHAnsi" w:hAnsiTheme="minorHAnsi" w:cstheme="minorHAnsi"/>
+          <w:i w:val="0"/>
+          <w:iCs w:val="0"/>
+        </w:rPr>
+        <w:t>Mockito</w:t>
+      </w:r>
+      <w:proofErr w:type="spellEnd"/>
+      <w:r>
+        <w:rPr>
+          <w:rStyle w:val="nfasis"/>
+          <w:rFonts w:asciiTheme="minorHAnsi" w:hAnsiTheme="minorHAnsi" w:cstheme="minorHAnsi"/>
+          <w:i w:val="0"/>
+          <w:iCs w:val="0"/>
+        </w:rPr>
+        <w:t xml:space="preserve">. </w:t>
+      </w:r>
+      <w:r>
+        <w:rPr>
+          <w:rStyle w:val="nfasis"/>
+          <w:rFonts w:asciiTheme="minorHAnsi" w:hAnsiTheme="minorHAnsi" w:cstheme="minorHAnsi"/>
+          <w:i w:val="0"/>
+          <w:iCs w:val="0"/>
+        </w:rPr>
+        <w:br/>
+      </w:r>
+      <w:r>
+        <w:rPr>
+          <w:rStyle w:val="nfasis"/>
+          <w:rFonts w:asciiTheme="minorHAnsi" w:hAnsiTheme="minorHAnsi" w:cstheme="minorHAnsi"/>
+          <w:i w:val="0"/>
+          <w:iCs w:val="0"/>
+        </w:rPr>
+        <w:br/>
+      </w:r>
+      <w:proofErr w:type="spellStart"/>
+      <w:r>
+        <w:rPr>
+          <w:rStyle w:val="CdigoHTML"/>
+          <w:rFonts w:asciiTheme="minorHAnsi" w:hAnsiTheme="minorHAnsi" w:cstheme="minorHAnsi"/>
+          <w:i/>
+          <w:iCs/>
+        </w:rPr>
+        <w:t>eliminarVenta</w:t>
+      </w:r>
+      <w:proofErr w:type="spellEnd"/>
+      <w:r>
+        <w:rPr>
+          <w:rStyle w:val="nfasis"/>
+          <w:rFonts w:asciiTheme="minorHAnsi" w:hAnsiTheme="minorHAnsi" w:cstheme="minorHAnsi"/>
+          <w:i w:val="0"/>
+          <w:iCs w:val="0"/>
+        </w:rPr>
+        <w:t xml:space="preserve"> en </w:t>
+      </w:r>
+      <w:r>
+        <w:rPr>
+          <w:rStyle w:val="CdigoHTML"/>
+          <w:rFonts w:asciiTheme="minorHAnsi" w:hAnsiTheme="minorHAnsi" w:cstheme="minorHAnsi"/>
+          <w:i/>
+          <w:iCs/>
+        </w:rPr>
+        <w:t>VentaServiceTest.java</w:t>
+      </w:r>
+      <w:r>
+        <w:rPr>
+          <w:rStyle w:val="nfasis"/>
+          <w:rFonts w:asciiTheme="minorHAnsi" w:hAnsiTheme="minorHAnsi" w:cstheme="minorHAnsi"/>
+          <w:i w:val="0"/>
+          <w:iCs w:val="0"/>
+        </w:rPr>
+        <w:t xml:space="preserve">, y corregir el </w:t>
+      </w:r>
+      <w:proofErr w:type="spellStart"/>
+      <w:r>
+        <w:rPr>
+          <w:rStyle w:val="CdigoHTML"/>
+          <w:rFonts w:asciiTheme="minorHAnsi" w:hAnsiTheme="minorHAnsi" w:cstheme="minorHAnsi"/>
+          <w:i/>
+          <w:iCs/>
+        </w:rPr>
+        <w:t>MsJardinVentasApplicationTests</w:t>
+      </w:r>
+      <w:proofErr w:type="spellEnd"/>
+      <w:r>
+        <w:rPr>
+          <w:rStyle w:val="nfasis"/>
+          <w:rFonts w:asciiTheme="minorHAnsi" w:hAnsiTheme="minorHAnsi" w:cstheme="minorHAnsi"/>
+          <w:i w:val="0"/>
+          <w:iCs w:val="0"/>
+        </w:rPr>
+        <w:t xml:space="preserve"> que intentaba conectarse a MySQL al ejecutar los </w:t>
+      </w:r>
+      <w:proofErr w:type="spellStart"/>
+      <w:r>
+        <w:rPr>
+          <w:rStyle w:val="nfasis"/>
+          <w:rFonts w:asciiTheme="minorHAnsi" w:hAnsiTheme="minorHAnsi" w:cstheme="minorHAnsi"/>
+          <w:i w:val="0"/>
+          <w:iCs w:val="0"/>
+        </w:rPr>
+        <w:t>tests</w:t>
+      </w:r>
+      <w:proofErr w:type="spellEnd"/>
+      <w:r>
+        <w:rPr>
+          <w:rStyle w:val="nfasis"/>
+          <w:rFonts w:asciiTheme="minorHAnsi" w:hAnsiTheme="minorHAnsi" w:cstheme="minorHAnsi"/>
+          <w:i w:val="0"/>
+          <w:iCs w:val="0"/>
+        </w:rPr>
+        <w:t>.</w:t>
+      </w:r>
+    </w:p>
+    <w:p>
+      <w:pPr>
+        <w:pStyle w:val="font-claude-response-body"/>
+        <w:rPr>
+          <w:rFonts w:asciiTheme="minorHAnsi" w:hAnsiTheme="minorHAnsi" w:cstheme="minorHAnsi"/>
+          <w:i/>
+          <w:iCs/>
+        </w:rPr>
+      </w:pPr>
+      <w:r>
+        <w:rPr>
+          <w:rStyle w:val="nfasis"/>
+          <w:rFonts w:asciiTheme="minorHAnsi" w:hAnsiTheme="minorHAnsi" w:cstheme="minorHAnsi"/>
+          <w:i w:val="0"/>
+          <w:iCs w:val="0"/>
+        </w:rPr>
+        <w:t xml:space="preserve">Para resolver el problema de MySQL, agregué el perfil </w:t>
+      </w:r>
+      <w:r>
+        <w:rPr>
+          <w:rStyle w:val="CdigoHTML"/>
+          <w:rFonts w:asciiTheme="minorHAnsi" w:hAnsiTheme="minorHAnsi" w:cstheme="minorHAnsi"/>
+          <w:i/>
+          <w:iCs/>
+        </w:rPr>
+        <w:t>test</w:t>
+      </w:r>
+      <w:r>
+        <w:rPr>
+          <w:rStyle w:val="nfasis"/>
+          <w:rFonts w:asciiTheme="minorHAnsi" w:hAnsiTheme="minorHAnsi" w:cstheme="minorHAnsi"/>
+          <w:i w:val="0"/>
+          <w:iCs w:val="0"/>
+        </w:rPr>
+        <w:t xml:space="preserve"> con </w:t>
+      </w:r>
+      <w:r>
+        <w:rPr>
+          <w:rStyle w:val="CdigoHTML"/>
+          <w:rFonts w:asciiTheme="minorHAnsi" w:hAnsiTheme="minorHAnsi" w:cstheme="minorHAnsi"/>
+          <w:i/>
+          <w:iCs/>
+        </w:rPr>
+        <w:t>@ActiveProfiles("test")</w:t>
+      </w:r>
+      <w:r>
+        <w:rPr>
+          <w:rStyle w:val="nfasis"/>
+          <w:rFonts w:asciiTheme="minorHAnsi" w:hAnsiTheme="minorHAnsi" w:cstheme="minorHAnsi"/>
+          <w:i w:val="0"/>
+          <w:iCs w:val="0"/>
+        </w:rPr>
+        <w:t xml:space="preserve"> en </w:t>
+      </w:r>
+      <w:proofErr w:type="spellStart"/>
+      <w:r>
+        <w:rPr>
+          <w:rStyle w:val="CdigoHTML"/>
+          <w:rFonts w:asciiTheme="minorHAnsi" w:hAnsiTheme="minorHAnsi" w:cstheme="minorHAnsi"/>
+          <w:i/>
+          <w:iCs/>
+        </w:rPr>
+        <w:t>MsJardinVentasApplicationTests</w:t>
+      </w:r>
+      <w:proofErr w:type="spellEnd"/>
+      <w:r>
+        <w:rPr>
+          <w:rStyle w:val="nfasis"/>
+          <w:rFonts w:asciiTheme="minorHAnsi" w:hAnsiTheme="minorHAnsi" w:cstheme="minorHAnsi"/>
+          <w:i w:val="0"/>
+          <w:iCs w:val="0"/>
+        </w:rPr>
+        <w:t xml:space="preserve"> y creé el archivo </w:t>
+      </w:r>
+      <w:proofErr w:type="spellStart"/>
+      <w:r>
+        <w:rPr>
+          <w:rStyle w:val="CdigoHTML"/>
+          <w:rFonts w:asciiTheme="minorHAnsi" w:hAnsiTheme="minorHAnsi" w:cstheme="minorHAnsi"/>
+          <w:i/>
+          <w:iCs/>
+        </w:rPr>
+        <w:t>application-</w:t>
+      </w:r>
+      <w:proofErr w:type="gramStart"/>
+      <w:r>
+        <w:rPr>
+          <w:rStyle w:val="CdigoHTML"/>
+          <w:rFonts w:asciiTheme="minorHAnsi" w:hAnsiTheme="minorHAnsi" w:cstheme="minorHAnsi"/>
+          <w:i/>
+          <w:iCs/>
+        </w:rPr>
+        <w:t>test.properties</w:t>
+      </w:r>
+      <w:proofErr w:type="spellEnd"/>
+      <w:proofErr w:type="gramEnd"/>
+      <w:r>
+        <w:rPr>
+          <w:rStyle w:val="nfasis"/>
+          <w:rFonts w:asciiTheme="minorHAnsi" w:hAnsiTheme="minorHAnsi" w:cstheme="minorHAnsi"/>
+          <w:i w:val="0"/>
+          <w:iCs w:val="0"/>
+        </w:rPr>
+        <w:t xml:space="preserve"> con configuración de base de datos H2 en memoria, que no requiere conexión a MySQL.</w:t>
+      </w:r>
+    </w:p>
+    <w:p>
+      <w:pPr>
+        <w:pStyle w:val="font-claude-response-body"/>
+        <w:rPr>
+          <w:rFonts w:asciiTheme="minorHAnsi" w:hAnsiTheme="minorHAnsi" w:cstheme="minorHAnsi"/>
+          <w:i/>
+          <w:iCs/>
+        </w:rPr>
+      </w:pPr>
+      <w:r>
+        <w:rPr>
+          <w:rStyle w:val="nfasis"/>
+          <w:rFonts w:asciiTheme="minorHAnsi" w:hAnsiTheme="minorHAnsi" w:cstheme="minorHAnsi"/>
+          <w:i w:val="0"/>
+          <w:iCs w:val="0"/>
+        </w:rPr>
+        <w:t xml:space="preserve">Para el test de </w:t>
+      </w:r>
+      <w:proofErr w:type="spellStart"/>
+      <w:r>
+        <w:rPr>
+          <w:rStyle w:val="CdigoHTML"/>
+          <w:rFonts w:asciiTheme="minorHAnsi" w:hAnsiTheme="minorHAnsi" w:cstheme="minorHAnsi"/>
+          <w:i/>
+          <w:iCs/>
+        </w:rPr>
+        <w:t>eliminarVenta</w:t>
+      </w:r>
+      <w:proofErr w:type="spellEnd"/>
+      <w:r>
+        <w:rPr>
+          <w:rStyle w:val="nfasis"/>
+          <w:rFonts w:asciiTheme="minorHAnsi" w:hAnsiTheme="minorHAnsi" w:cstheme="minorHAnsi"/>
+          <w:i w:val="0"/>
+          <w:iCs w:val="0"/>
+        </w:rPr>
+        <w:t xml:space="preserve">, usé </w:t>
+      </w:r>
+      <w:proofErr w:type="spellStart"/>
+      <w:r>
+        <w:rPr>
+          <w:rStyle w:val="nfasis"/>
+          <w:rFonts w:asciiTheme="minorHAnsi" w:hAnsiTheme="minorHAnsi" w:cstheme="minorHAnsi"/>
+          <w:i w:val="0"/>
+          <w:iCs w:val="0"/>
+        </w:rPr>
+        <w:t>Mockito</w:t>
+      </w:r>
+      <w:proofErr w:type="spellEnd"/>
+      <w:r>
+        <w:rPr>
+          <w:rStyle w:val="nfasis"/>
+          <w:rFonts w:asciiTheme="minorHAnsi" w:hAnsiTheme="minorHAnsi" w:cstheme="minorHAnsi"/>
+          <w:i w:val="0"/>
+          <w:iCs w:val="0"/>
+        </w:rPr>
+        <w:t xml:space="preserve"> para simular el </w:t>
+      </w:r>
+      <w:proofErr w:type="spellStart"/>
+      <w:r>
+        <w:rPr>
+          <w:rStyle w:val="CdigoHTML"/>
+          <w:rFonts w:asciiTheme="minorHAnsi" w:hAnsiTheme="minorHAnsi" w:cstheme="minorHAnsi"/>
+          <w:i/>
+          <w:iCs/>
+        </w:rPr>
+        <w:t>VentaRepository</w:t>
+      </w:r>
+      <w:proofErr w:type="spellEnd"/>
+      <w:r>
+        <w:rPr>
+          <w:rStyle w:val="nfasis"/>
+          <w:rFonts w:asciiTheme="minorHAnsi" w:hAnsiTheme="minorHAnsi" w:cstheme="minorHAnsi"/>
+          <w:i w:val="0"/>
+          <w:iCs w:val="0"/>
+        </w:rPr>
+        <w:t xml:space="preserve">. En el </w:t>
+      </w:r>
+      <w:proofErr w:type="spellStart"/>
+      <w:r>
+        <w:rPr>
+          <w:rStyle w:val="nfasis"/>
+          <w:rFonts w:asciiTheme="minorHAnsi" w:hAnsiTheme="minorHAnsi" w:cstheme="minorHAnsi"/>
+          <w:i w:val="0"/>
+          <w:iCs w:val="0"/>
+        </w:rPr>
+        <w:t>Given</w:t>
+      </w:r>
+      <w:proofErr w:type="spellEnd"/>
+      <w:r>
+        <w:rPr>
+          <w:rStyle w:val="nfasis"/>
+          <w:rFonts w:asciiTheme="minorHAnsi" w:hAnsiTheme="minorHAnsi" w:cstheme="minorHAnsi"/>
+          <w:i w:val="0"/>
+          <w:iCs w:val="0"/>
+        </w:rPr>
+        <w:t xml:space="preserve"> programé al simulador para que responda con </w:t>
+      </w:r>
+      <w:proofErr w:type="spellStart"/>
+      <w:r>
+        <w:rPr>
+          <w:rStyle w:val="CdigoHTML"/>
+          <w:rFonts w:asciiTheme="minorHAnsi" w:hAnsiTheme="minorHAnsi" w:cstheme="minorHAnsi"/>
+          <w:i/>
+          <w:iCs/>
+        </w:rPr>
+        <w:t>ventaFalsa</w:t>
+      </w:r>
+      <w:proofErr w:type="spellEnd"/>
+      <w:r>
+        <w:rPr>
+          <w:rStyle w:val="nfasis"/>
+          <w:rFonts w:asciiTheme="minorHAnsi" w:hAnsiTheme="minorHAnsi" w:cstheme="minorHAnsi"/>
+          <w:i w:val="0"/>
+          <w:iCs w:val="0"/>
+        </w:rPr>
+        <w:t xml:space="preserve"> cuando le pregunten por el id 1. En el </w:t>
+      </w:r>
+      <w:proofErr w:type="spellStart"/>
+      <w:r>
+        <w:rPr>
+          <w:rStyle w:val="nfasis"/>
+          <w:rFonts w:asciiTheme="minorHAnsi" w:hAnsiTheme="minorHAnsi" w:cstheme="minorHAnsi"/>
+          <w:i w:val="0"/>
+          <w:iCs w:val="0"/>
+        </w:rPr>
+        <w:t>When</w:t>
+      </w:r>
+      <w:proofErr w:type="spellEnd"/>
+      <w:r>
+        <w:rPr>
+          <w:rStyle w:val="nfasis"/>
+          <w:rFonts w:asciiTheme="minorHAnsi" w:hAnsiTheme="minorHAnsi" w:cstheme="minorHAnsi"/>
+          <w:i w:val="0"/>
+          <w:iCs w:val="0"/>
+        </w:rPr>
+        <w:t xml:space="preserve"> ejecuté el método real </w:t>
+      </w:r>
+      <w:proofErr w:type="spellStart"/>
+      <w:r>
+        <w:rPr>
+          <w:rStyle w:val="CdigoHTML"/>
+          <w:rFonts w:asciiTheme="minorHAnsi" w:hAnsiTheme="minorHAnsi" w:cstheme="minorHAnsi"/>
+          <w:i/>
+          <w:iCs/>
+        </w:rPr>
+        <w:t>eliminarVenta</w:t>
+      </w:r>
+      <w:proofErr w:type="spellEnd"/>
+      <w:r>
+        <w:rPr>
+          <w:rStyle w:val="nfasis"/>
+          <w:rFonts w:asciiTheme="minorHAnsi" w:hAnsiTheme="minorHAnsi" w:cstheme="minorHAnsi"/>
+          <w:i w:val="0"/>
+          <w:iCs w:val="0"/>
+        </w:rPr>
+        <w:t xml:space="preserve">. En el </w:t>
+      </w:r>
+      <w:proofErr w:type="spellStart"/>
+      <w:r>
+        <w:rPr>
+          <w:rStyle w:val="nfasis"/>
+          <w:rFonts w:asciiTheme="minorHAnsi" w:hAnsiTheme="minorHAnsi" w:cstheme="minorHAnsi"/>
+          <w:i w:val="0"/>
+          <w:iCs w:val="0"/>
+        </w:rPr>
+        <w:t>Then</w:t>
+      </w:r>
+      <w:proofErr w:type="spellEnd"/>
+      <w:r>
+        <w:rPr>
+          <w:rStyle w:val="nfasis"/>
+          <w:rFonts w:asciiTheme="minorHAnsi" w:hAnsiTheme="minorHAnsi" w:cstheme="minorHAnsi"/>
+          <w:i w:val="0"/>
+          <w:iCs w:val="0"/>
+        </w:rPr>
+        <w:t xml:space="preserve"> verifiqué que el repositorio recibió la orden de eliminar exactamente una vez.</w:t>
+      </w:r>
+    </w:p>
+    <w:p>
+      <w:pPr>
+        <w:pStyle w:val="font-claude-response-body"/>
+        <w:rPr>
+          <w:rFonts w:asciiTheme="minorHAnsi" w:hAnsiTheme="minorHAnsi" w:cstheme="minorHAnsi"/>
+          <w:i/>
+          <w:iCs/>
+        </w:rPr>
+      </w:pPr>
+      <w:r>
+        <w:rPr>
+          <w:rStyle w:val="nfasis"/>
+          <w:rFonts w:asciiTheme="minorHAnsi" w:hAnsiTheme="minorHAnsi" w:cstheme="minorHAnsi"/>
+          <w:i w:val="0"/>
+          <w:iCs w:val="0"/>
+        </w:rPr>
+        <w:t xml:space="preserve">Resultado: 4 </w:t>
+      </w:r>
+      <w:proofErr w:type="spellStart"/>
+      <w:r>
+        <w:rPr>
+          <w:rStyle w:val="nfasis"/>
+          <w:rFonts w:asciiTheme="minorHAnsi" w:hAnsiTheme="minorHAnsi" w:cstheme="minorHAnsi"/>
+          <w:i w:val="0"/>
+          <w:iCs w:val="0"/>
+        </w:rPr>
+        <w:t>tests</w:t>
+      </w:r>
+      <w:proofErr w:type="spellEnd"/>
+      <w:r>
+        <w:rPr>
+          <w:rStyle w:val="nfasis"/>
+          <w:rFonts w:asciiTheme="minorHAnsi" w:hAnsiTheme="minorHAnsi" w:cstheme="minorHAnsi"/>
+          <w:i w:val="0"/>
+          <w:iCs w:val="0"/>
+        </w:rPr>
+        <w:t xml:space="preserve"> en verde sin conexión a MySQL</w:t>
+      </w:r>
+    </w:p>
     <w:p>
       <w:pPr>
         <w:tabs>
           <w:tab w:val="left" w:pos="1530"/>
         </w:tabs>
-      </w:pPr>
-      <w:r>
-        <w:tab/>
-      </w:r>
-    </w:p>
-    <w:p>
-      <w:pPr>
-        <w:tabs>
-          <w:tab w:val="left" w:pos="1530"/>
-        </w:tabs>
-        <w:rPr>
-          <w:noProof/>
-        </w:rPr>
-      </w:pPr>
-    </w:p>
-    <w:p>
-      <w:pPr>
-        <w:tabs>
-          <w:tab w:val="left" w:pos="1530"/>
-        </w:tabs>
-        <w:rPr>
-          <w:noProof/>
-        </w:rPr>
       </w:pPr>
     </w:p>
     <w:p>
@@ -795,6 +1426,44 @@
     <w:semiHidden/>
     <w:unhideWhenUsed/>
   </w:style>
+  <w:style w:type="paragraph" w:customStyle="1" w:styleId="font-claude-response-body">
+    <w:name w:val="font-claude-response-body"/>
+    <w:basedOn w:val="Normal"/>
+    <w:rsid w:val="001A7D73"/>
+    <w:pPr>
+      <w:spacing w:before="100" w:beforeAutospacing="1" w:after="100" w:afterAutospacing="1" w:line="240" w:lineRule="auto"/>
+    </w:pPr>
+    <w:rPr>
+      <w:rFonts w:ascii="Times New Roman" w:eastAsia="Times New Roman" w:hAnsi="Times New Roman" w:cs="Times New Roman"/>
+      <w:sz w:val="24"/>
+      <w:szCs w:val="24"/>
+      <w:lang w:eastAsia="es-419"/>
+    </w:rPr>
+  </w:style>
+  <w:style w:type="character" w:styleId="nfasis">
+    <w:name w:val="Emphasis"/>
+    <w:basedOn w:val="Fuentedeprrafopredeter"/>
+    <w:uiPriority w:val="20"/>
+    <w:qFormat/>
+    <w:rsid w:val="001A7D73"/>
+    <w:rPr>
+      <w:i/>
+      <w:iCs/>
+    </w:rPr>
+  </w:style>
+  <w:style w:type="character" w:styleId="CdigoHTML">
+    <w:name w:val="HTML Code"/>
+    <w:basedOn w:val="Fuentedeprrafopredeter"/>
+    <w:uiPriority w:val="99"/>
+    <w:semiHidden/>
+    <w:unhideWhenUsed/>
+    <w:rsid w:val="001A7D73"/>
+    <w:rPr>
+      <w:rFonts w:ascii="Courier New" w:eastAsia="Times New Roman" w:hAnsi="Courier New" w:cs="Courier New"/>
+      <w:sz w:val="20"/>
+      <w:szCs w:val="20"/>
+    </w:rPr>
+  </w:style>
 </w:styles>
 </file>
 

</xml_diff>